<commit_message>
Update project files and report
</commit_message>
<xml_diff>
--- a/reports/Inventory_Demand_Prediction_ProjectReport.docx
+++ b/reports/Inventory_Demand_Prediction_ProjectReport.docx
@@ -5,11 +5,16 @@
     <w:p>
       <w:pPr>
         <w:jc w:val="center"/>
+        <w:rPr>
+          <w:sz w:val="44"/>
+          <w:szCs w:val="44"/>
+        </w:rPr>
       </w:pPr>
       <w:r>
         <w:rPr>
           <w:b/>
-          <w:sz w:val="36"/>
+          <w:sz w:val="44"/>
+          <w:szCs w:val="44"/>
         </w:rPr>
         <w:t>Inventory Demand Prediction and Stock Optimization Intelligence System</w:t>
       </w:r>
@@ -17,6 +22,10 @@
     <w:p>
       <w:pPr>
         <w:jc w:val="center"/>
+        <w:rPr>
+          <w:b/>
+          <w:sz w:val="26"/>
+        </w:rPr>
       </w:pPr>
       <w:r>
         <w:rPr>
@@ -26,7 +35,334 @@
         <w:t>Business Intelligence Project Report</w:t>
       </w:r>
     </w:p>
-    <w:p/>
+    <w:p>
+      <w:pPr>
+        <w:jc w:val="center"/>
+        <w:rPr>
+          <w:b/>
+          <w:sz w:val="26"/>
+        </w:rPr>
+      </w:pPr>
+    </w:p>
+    <w:p>
+      <w:pPr>
+        <w:jc w:val="center"/>
+        <w:rPr>
+          <w:b/>
+          <w:sz w:val="26"/>
+        </w:rPr>
+      </w:pPr>
+    </w:p>
+    <w:p>
+      <w:pPr>
+        <w:rPr>
+          <w:b/>
+          <w:sz w:val="26"/>
+        </w:rPr>
+      </w:pPr>
+      <w:r>
+        <w:rPr>
+          <w:b/>
+          <w:sz w:val="26"/>
+        </w:rPr>
+        <w:t xml:space="preserve">    </w:t>
+      </w:r>
+    </w:p>
+    <w:p>
+      <w:pPr>
+        <w:rPr>
+          <w:bCs/>
+          <w:sz w:val="26"/>
+        </w:rPr>
+      </w:pPr>
+      <w:r>
+        <w:rPr>
+          <w:bCs/>
+          <w:sz w:val="26"/>
+        </w:rPr>
+        <w:t xml:space="preserve">                     Prepared by: Bagulakoti Abhigna</w:t>
+      </w:r>
+    </w:p>
+    <w:p>
+      <w:pPr>
+        <w:rPr>
+          <w:bCs/>
+          <w:sz w:val="26"/>
+        </w:rPr>
+      </w:pPr>
+      <w:r>
+        <w:rPr>
+          <w:bCs/>
+          <w:sz w:val="26"/>
+        </w:rPr>
+        <w:t xml:space="preserve">                     Dataset: Retail Store inventory Forecasting Dataset</w:t>
+      </w:r>
+    </w:p>
+    <w:p>
+      <w:pPr>
+        <w:rPr>
+          <w:bCs/>
+          <w:sz w:val="26"/>
+        </w:rPr>
+      </w:pPr>
+      <w:r>
+        <w:rPr>
+          <w:bCs/>
+          <w:sz w:val="26"/>
+        </w:rPr>
+        <w:t xml:space="preserve">                     Development Environment: Python, VS Code, GitHub             </w:t>
+      </w:r>
+    </w:p>
+    <w:p>
+      <w:pPr>
+        <w:rPr>
+          <w:bCs/>
+          <w:sz w:val="26"/>
+        </w:rPr>
+      </w:pPr>
+      <w:r>
+        <w:rPr>
+          <w:bCs/>
+          <w:sz w:val="26"/>
+        </w:rPr>
+        <w:t xml:space="preserve">                     and </w:t>
+      </w:r>
+      <w:proofErr w:type="spellStart"/>
+      <w:r>
+        <w:rPr>
+          <w:bCs/>
+          <w:sz w:val="26"/>
+        </w:rPr>
+        <w:t>Streamlit</w:t>
+      </w:r>
+      <w:proofErr w:type="spellEnd"/>
+      <w:r>
+        <w:rPr>
+          <w:bCs/>
+          <w:sz w:val="26"/>
+        </w:rPr>
+        <w:t>.</w:t>
+      </w:r>
+    </w:p>
+    <w:p>
+      <w:pPr>
+        <w:jc w:val="center"/>
+        <w:rPr>
+          <w:b/>
+          <w:sz w:val="26"/>
+        </w:rPr>
+      </w:pPr>
+    </w:p>
+    <w:p>
+      <w:pPr>
+        <w:jc w:val="center"/>
+        <w:rPr>
+          <w:b/>
+          <w:sz w:val="26"/>
+        </w:rPr>
+      </w:pPr>
+    </w:p>
+    <w:p>
+      <w:pPr>
+        <w:jc w:val="center"/>
+        <w:rPr>
+          <w:b/>
+          <w:sz w:val="26"/>
+        </w:rPr>
+      </w:pPr>
+    </w:p>
+    <w:p>
+      <w:pPr>
+        <w:jc w:val="center"/>
+        <w:rPr>
+          <w:b/>
+          <w:sz w:val="26"/>
+        </w:rPr>
+      </w:pPr>
+    </w:p>
+    <w:p>
+      <w:pPr>
+        <w:jc w:val="center"/>
+        <w:rPr>
+          <w:b/>
+          <w:sz w:val="26"/>
+        </w:rPr>
+      </w:pPr>
+    </w:p>
+    <w:p>
+      <w:pPr>
+        <w:jc w:val="center"/>
+        <w:rPr>
+          <w:b/>
+          <w:sz w:val="26"/>
+        </w:rPr>
+      </w:pPr>
+    </w:p>
+    <w:p>
+      <w:pPr>
+        <w:jc w:val="center"/>
+        <w:rPr>
+          <w:b/>
+          <w:sz w:val="26"/>
+        </w:rPr>
+      </w:pPr>
+    </w:p>
+    <w:p>
+      <w:pPr>
+        <w:jc w:val="center"/>
+        <w:rPr>
+          <w:b/>
+          <w:sz w:val="26"/>
+        </w:rPr>
+      </w:pPr>
+    </w:p>
+    <w:p>
+      <w:pPr>
+        <w:jc w:val="center"/>
+        <w:rPr>
+          <w:b/>
+          <w:sz w:val="26"/>
+        </w:rPr>
+      </w:pPr>
+    </w:p>
+    <w:p>
+      <w:pPr>
+        <w:jc w:val="center"/>
+        <w:rPr>
+          <w:b/>
+          <w:sz w:val="26"/>
+        </w:rPr>
+      </w:pPr>
+    </w:p>
+    <w:p>
+      <w:pPr>
+        <w:jc w:val="center"/>
+        <w:rPr>
+          <w:b/>
+          <w:sz w:val="26"/>
+        </w:rPr>
+      </w:pPr>
+    </w:p>
+    <w:p>
+      <w:pPr>
+        <w:jc w:val="center"/>
+        <w:rPr>
+          <w:b/>
+          <w:sz w:val="26"/>
+        </w:rPr>
+      </w:pPr>
+    </w:p>
+    <w:p>
+      <w:pPr>
+        <w:jc w:val="center"/>
+        <w:rPr>
+          <w:b/>
+          <w:sz w:val="26"/>
+        </w:rPr>
+      </w:pPr>
+    </w:p>
+    <w:p>
+      <w:pPr>
+        <w:jc w:val="center"/>
+        <w:rPr>
+          <w:b/>
+          <w:sz w:val="26"/>
+        </w:rPr>
+      </w:pPr>
+    </w:p>
+    <w:p>
+      <w:pPr>
+        <w:jc w:val="center"/>
+      </w:pPr>
+    </w:p>
+    <w:p>
+      <w:pPr>
+        <w:jc w:val="both"/>
+        <w:rPr>
+          <w:b/>
+          <w:bCs/>
+          <w:color w:val="365F91" w:themeColor="accent1" w:themeShade="BF"/>
+          <w:sz w:val="28"/>
+          <w:szCs w:val="28"/>
+        </w:rPr>
+      </w:pPr>
+      <w:r>
+        <w:t xml:space="preserve"> </w:t>
+      </w:r>
+      <w:r>
+        <w:t xml:space="preserve">       </w:t>
+      </w:r>
+      <w:r>
+        <w:rPr>
+          <w:b/>
+          <w:bCs/>
+          <w:color w:val="1F497D" w:themeColor="text2"/>
+          <w:sz w:val="28"/>
+          <w:szCs w:val="28"/>
+        </w:rPr>
+        <w:t xml:space="preserve">1. </w:t>
+      </w:r>
+      <w:r>
+        <w:rPr>
+          <w:b/>
+          <w:bCs/>
+          <w:color w:val="365F91" w:themeColor="accent1" w:themeShade="BF"/>
+          <w:sz w:val="28"/>
+          <w:szCs w:val="28"/>
+        </w:rPr>
+        <w:t>Abstract</w:t>
+      </w:r>
+    </w:p>
+    <w:p>
+      <w:pPr>
+        <w:ind w:left="360"/>
+      </w:pPr>
+      <w:r>
+        <w:t xml:space="preserve">This project, titled “Inventory Demand Prediction and Stock Optimization Intelligence </w:t>
+      </w:r>
+      <w:r>
+        <w:t xml:space="preserve">                                                 </w:t>
+      </w:r>
+      <w:r>
+        <w:t xml:space="preserve">             </w:t>
+      </w:r>
+      <w:r>
+        <w:t>system”,</w:t>
+      </w:r>
+      <w:r>
+        <w:t xml:space="preserve"> is a Business Intelligence and Predictive Analytics project developed to analyze retail inventory, sales, ordering, and demand patterns. The project uses the Retail Store Inventory Forecasting Dataset, which contains 73,100 records and 15 variables related to store inventory, product sales, demand forecasts, pricing, discounts, weather conditions, promotions, competitor pricing, and seasonality. The project performs data preprocessing, Key Performance Indicator (KPI) analysis, exploratory data analysis, inventory risk analysis, and demand prediction. A Linear Regression model is used to estimate units sold based on selected inventory and pricing-related features. An interactive </w:t>
+      </w:r>
+      <w:proofErr w:type="spellStart"/>
+      <w:r>
+        <w:t>Streamlit</w:t>
+      </w:r>
+      <w:proofErr w:type="spellEnd"/>
+      <w:r>
+        <w:t xml:space="preserve"> Business Intelligence dashboard was developed to present important KPIs, category-wise sales, region-wise sales, demand forecast versus actual sales, and inventory risk information. The project identifies potential low-inventory and high-inventory records and converts the analytical results into understandable business insights. The system demonstrates how Business Intelligence and </w:t>
+      </w:r>
+      <w:r>
+        <w:t xml:space="preserve">   </w:t>
+      </w:r>
+      <w:r>
+        <w:t xml:space="preserve">Predictive Analytics can support inventory monitoring, demand understanding, and stock </w:t>
+      </w:r>
+      <w:r>
+        <w:t xml:space="preserve">   </w:t>
+      </w:r>
+      <w:r>
+        <w:t>optimization decisions.</w:t>
+      </w:r>
+    </w:p>
+    <w:p>
+      <w:pPr>
+        <w:ind w:left="360"/>
+      </w:pPr>
+    </w:p>
+    <w:p>
+      <w:pPr>
+        <w:ind w:left="360"/>
+      </w:pPr>
+    </w:p>
     <w:p>
       <w:pPr>
         <w:pStyle w:val="ListBullet"/>
@@ -51,7 +387,17 @@
           <w:sz w:val="28"/>
           <w:szCs w:val="28"/>
         </w:rPr>
-        <w:t>1. Introduction</w:t>
+        <w:t xml:space="preserve">2. </w:t>
+      </w:r>
+      <w:r>
+        <w:rPr>
+          <w:b/>
+          <w:bCs/>
+          <w:color w:val="1F497D" w:themeColor="text2"/>
+          <w:sz w:val="28"/>
+          <w:szCs w:val="28"/>
+        </w:rPr>
+        <w:t xml:space="preserve"> Introduction</w:t>
       </w:r>
     </w:p>
     <w:p>
@@ -64,11 +410,18 @@
         <w:ind w:left="360" w:hanging="360"/>
       </w:pPr>
       <w:r>
-        <w:t xml:space="preserve">      </w:t>
-      </w:r>
-      <w:r>
-        <w:t>This project develops a Business Intelligence system for analyzing retail inventory, understanding sales patterns, predicting demand, and identifying potential inventory risks. The project follows an end-to-end analytics workflow: Raw Data → Data Cleaning → Exploratory Data Analysis → Demand Prediction → Dashboard → Business Insights.</w:t>
-      </w:r>
+        <w:t xml:space="preserve">      This project develops a Business Intelligence system for analyzing retail inventory, understanding sales patterns, predicting demand, and identifying potential inventory risks. The project follows an end-to-end analytics workflow: Raw Data → Data Cleaning → Exploratory Data Analysis → Demand Prediction → Dashboard → Business Insights.</w:t>
+      </w:r>
+    </w:p>
+    <w:p>
+      <w:pPr>
+        <w:pStyle w:val="ListBullet"/>
+        <w:numPr>
+          <w:ilvl w:val="0"/>
+          <w:numId w:val="0"/>
+        </w:numPr>
+        <w:ind w:left="360" w:hanging="360"/>
+      </w:pPr>
     </w:p>
     <w:p>
       <w:pPr>
@@ -110,8 +463,11 @@
         <w:rPr>
           <w:b/>
           <w:bCs/>
+          <w:color w:val="1F497D" w:themeColor="text2"/>
+          <w:sz w:val="28"/>
+          <w:szCs w:val="28"/>
         </w:rPr>
-        <w:t xml:space="preserve">      </w:t>
+        <w:t xml:space="preserve">     </w:t>
       </w:r>
       <w:r>
         <w:rPr>
@@ -121,52 +477,9 @@
           <w:sz w:val="28"/>
           <w:szCs w:val="28"/>
         </w:rPr>
-        <w:t>2. Business Problem</w:t>
-      </w:r>
-    </w:p>
-    <w:p>
-      <w:pPr>
-        <w:pStyle w:val="ListBullet"/>
-        <w:numPr>
-          <w:ilvl w:val="0"/>
-          <w:numId w:val="0"/>
-        </w:numPr>
-        <w:ind w:left="360" w:hanging="360"/>
-      </w:pPr>
-      <w:r>
-        <w:t xml:space="preserve">      </w:t>
-      </w:r>
-      <w:r>
-        <w:t>Retail businesses need to maintain appropriate inventory levels. Excess inventory can increase holding and storage costs, while insufficient inventory can create potential stock shortages and missed sales opportunities. The objective of this project is to use historical retail data to understand demand and inventory patterns and provide useful information for inventory planning.</w:t>
-      </w:r>
-    </w:p>
-    <w:p>
-      <w:pPr>
-        <w:pStyle w:val="ListBullet"/>
-        <w:numPr>
-          <w:ilvl w:val="0"/>
-          <w:numId w:val="0"/>
-        </w:numPr>
-        <w:ind w:left="360" w:hanging="360"/>
-      </w:pPr>
-    </w:p>
-    <w:p>
-      <w:pPr>
-        <w:pStyle w:val="ListBullet"/>
-        <w:numPr>
-          <w:ilvl w:val="0"/>
-          <w:numId w:val="0"/>
-        </w:numPr>
-        <w:ind w:left="360" w:hanging="360"/>
-      </w:pPr>
-    </w:p>
-    <w:p>
-      <w:pPr>
-        <w:pStyle w:val="ListBullet"/>
-        <w:numPr>
-          <w:ilvl w:val="0"/>
-          <w:numId w:val="0"/>
-        </w:numPr>
+        <w:t xml:space="preserve">3. </w:t>
+      </w:r>
+      <w:r>
         <w:rPr>
           <w:b/>
           <w:bCs/>
@@ -174,8 +487,59 @@
           <w:sz w:val="28"/>
           <w:szCs w:val="28"/>
         </w:rPr>
-      </w:pPr>
-      <w:r>
+        <w:t>Business Problem</w:t>
+      </w:r>
+    </w:p>
+    <w:p>
+      <w:pPr>
+        <w:pStyle w:val="ListBullet"/>
+        <w:numPr>
+          <w:ilvl w:val="0"/>
+          <w:numId w:val="0"/>
+        </w:numPr>
+        <w:ind w:left="360" w:hanging="360"/>
+      </w:pPr>
+      <w:r>
+        <w:t xml:space="preserve">      Retail businesses need to maintain appropriate inventory levels. Excess inventory can increase holding and storage costs, while insufficient inventory can create potential stock shortages and missed sales opportunities. The objective of this project is to use historical retail data to understand demand and inventory patterns and provide useful information for inventory planning.</w:t>
+      </w:r>
+    </w:p>
+    <w:p>
+      <w:pPr>
+        <w:pStyle w:val="ListBullet"/>
+        <w:numPr>
+          <w:ilvl w:val="0"/>
+          <w:numId w:val="0"/>
+        </w:numPr>
+        <w:ind w:left="360" w:hanging="360"/>
+      </w:pPr>
+    </w:p>
+    <w:p>
+      <w:pPr>
+        <w:pStyle w:val="ListBullet"/>
+        <w:numPr>
+          <w:ilvl w:val="0"/>
+          <w:numId w:val="0"/>
+        </w:numPr>
+        <w:ind w:left="360" w:hanging="360"/>
+      </w:pPr>
+    </w:p>
+    <w:p>
+      <w:pPr>
+        <w:pStyle w:val="ListBullet"/>
+        <w:numPr>
+          <w:ilvl w:val="0"/>
+          <w:numId w:val="0"/>
+        </w:numPr>
+        <w:ind w:left="360" w:hanging="360"/>
+      </w:pPr>
+    </w:p>
+    <w:p>
+      <w:pPr>
+        <w:pStyle w:val="ListBullet"/>
+        <w:numPr>
+          <w:ilvl w:val="0"/>
+          <w:numId w:val="0"/>
+        </w:numPr>
         <w:rPr>
           <w:b/>
           <w:bCs/>
@@ -183,8 +547,7 @@
           <w:sz w:val="28"/>
           <w:szCs w:val="28"/>
         </w:rPr>
-        <w:t xml:space="preserve">      </w:t>
-      </w:r>
+      </w:pPr>
       <w:r>
         <w:rPr>
           <w:b/>
@@ -193,7 +556,27 @@
           <w:sz w:val="28"/>
           <w:szCs w:val="28"/>
         </w:rPr>
-        <w:t>3. Objectives</w:t>
+        <w:t xml:space="preserve">     </w:t>
+      </w:r>
+      <w:r>
+        <w:rPr>
+          <w:b/>
+          <w:bCs/>
+          <w:color w:val="1F497D" w:themeColor="text2"/>
+          <w:sz w:val="28"/>
+          <w:szCs w:val="28"/>
+        </w:rPr>
+        <w:t>4.</w:t>
+      </w:r>
+      <w:r>
+        <w:rPr>
+          <w:b/>
+          <w:bCs/>
+          <w:color w:val="1F497D" w:themeColor="text2"/>
+          <w:sz w:val="28"/>
+          <w:szCs w:val="28"/>
+        </w:rPr>
+        <w:t xml:space="preserve"> Objectives</w:t>
       </w:r>
     </w:p>
     <w:p>
@@ -217,6 +600,7 @@
         </w:numPr>
       </w:pPr>
       <w:r>
+        <w:lastRenderedPageBreak/>
         <w:t>Analyze sales patterns by category, region, and date.</w:t>
       </w:r>
     </w:p>
@@ -267,6 +651,16 @@
       <w:r>
         <w:t>Create an interactive dashboard for business users.</w:t>
       </w:r>
+    </w:p>
+    <w:p>
+      <w:pPr>
+        <w:pStyle w:val="ListBullet"/>
+        <w:numPr>
+          <w:ilvl w:val="0"/>
+          <w:numId w:val="0"/>
+        </w:numPr>
+        <w:ind w:left="360" w:hanging="360"/>
+      </w:pPr>
     </w:p>
     <w:p>
       <w:pPr>
@@ -312,7 +706,17 @@
           <w:sz w:val="28"/>
           <w:szCs w:val="28"/>
         </w:rPr>
-        <w:t>4. Dataset</w:t>
+        <w:t>5</w:t>
+      </w:r>
+      <w:r>
+        <w:rPr>
+          <w:b/>
+          <w:bCs/>
+          <w:color w:val="1F497D" w:themeColor="text2"/>
+          <w:sz w:val="28"/>
+          <w:szCs w:val="28"/>
+        </w:rPr>
+        <w:t>. Dataset</w:t>
       </w:r>
     </w:p>
     <w:p>
@@ -460,7 +864,6 @@
         </w:numPr>
       </w:pPr>
       <w:r>
-        <w:lastRenderedPageBreak/>
         <w:t>Demand Forecast</w:t>
       </w:r>
     </w:p>
@@ -535,6 +938,16 @@
       <w:r>
         <w:t>Seasonality</w:t>
       </w:r>
+    </w:p>
+    <w:p>
+      <w:pPr>
+        <w:pStyle w:val="ListBullet"/>
+        <w:numPr>
+          <w:ilvl w:val="0"/>
+          <w:numId w:val="0"/>
+        </w:numPr>
+        <w:ind w:left="360"/>
+      </w:pPr>
     </w:p>
     <w:p>
       <w:pPr>
@@ -580,120 +993,9 @@
           <w:sz w:val="28"/>
           <w:szCs w:val="28"/>
         </w:rPr>
-        <w:t>5. Data Cleaning</w:t>
-      </w:r>
-    </w:p>
-    <w:p>
-      <w:pPr>
-        <w:pStyle w:val="ListBullet"/>
-        <w:numPr>
-          <w:ilvl w:val="0"/>
-          <w:numId w:val="0"/>
-        </w:numPr>
-        <w:ind w:left="360"/>
-      </w:pPr>
-      <w:r>
-        <w:t>The raw CSV file was loaded using Pandas. Missing values and duplicate records were checked. The Date column was converted to datetime format, duplicate rows were removed, invalid dates were excluded, and column names were cleaned. The resulting dataset was saved as data/retail_store_inventory_cleaned.csv.</w:t>
-      </w:r>
-    </w:p>
-    <w:p>
-      <w:pPr>
-        <w:pStyle w:val="ListBullet"/>
-        <w:numPr>
-          <w:ilvl w:val="0"/>
-          <w:numId w:val="0"/>
-        </w:numPr>
-        <w:ind w:left="360"/>
-      </w:pPr>
-    </w:p>
-    <w:p>
-      <w:pPr>
-        <w:pStyle w:val="ListBullet"/>
-        <w:numPr>
-          <w:ilvl w:val="0"/>
-          <w:numId w:val="0"/>
-        </w:numPr>
-        <w:ind w:left="360"/>
-      </w:pPr>
-      <w:r>
-        <w:t>Cleaning results:</w:t>
-      </w:r>
-    </w:p>
-    <w:p>
-      <w:pPr>
-        <w:pStyle w:val="ListBullet"/>
-        <w:numPr>
-          <w:ilvl w:val="0"/>
-          <w:numId w:val="0"/>
-        </w:numPr>
-        <w:ind w:left="360"/>
-      </w:pPr>
-    </w:p>
-    <w:p>
-      <w:pPr>
-        <w:pStyle w:val="ListBullet"/>
-        <w:numPr>
-          <w:ilvl w:val="0"/>
-          <w:numId w:val="16"/>
-        </w:numPr>
-      </w:pPr>
-      <w:r>
-        <w:t>Dataset size before cleaning: 73,100 rows × 15 columns.</w:t>
-      </w:r>
-    </w:p>
-    <w:p>
-      <w:pPr>
-        <w:pStyle w:val="ListBullet"/>
-        <w:numPr>
-          <w:ilvl w:val="0"/>
-          <w:numId w:val="16"/>
-        </w:numPr>
-      </w:pPr>
-      <w:r>
-        <w:t>Missing values: 0.</w:t>
-      </w:r>
-    </w:p>
-    <w:p>
-      <w:pPr>
-        <w:pStyle w:val="ListBullet"/>
-        <w:numPr>
-          <w:ilvl w:val="0"/>
-          <w:numId w:val="16"/>
-        </w:numPr>
-      </w:pPr>
-      <w:r>
-        <w:t>Duplicate rows: 0.</w:t>
-      </w:r>
-    </w:p>
-    <w:p>
-      <w:pPr>
-        <w:pStyle w:val="ListBullet"/>
-        <w:numPr>
-          <w:ilvl w:val="0"/>
-          <w:numId w:val="16"/>
-        </w:numPr>
-      </w:pPr>
-      <w:r>
-        <w:t>Cleaned dataset size: 73,100 rows × 15 columns.</w:t>
-      </w:r>
-    </w:p>
-    <w:p>
-      <w:pPr>
-        <w:pStyle w:val="ListBullet"/>
-        <w:numPr>
-          <w:ilvl w:val="0"/>
-          <w:numId w:val="0"/>
-        </w:numPr>
-        <w:ind w:left="360"/>
-      </w:pPr>
-    </w:p>
-    <w:p>
-      <w:pPr>
-        <w:pStyle w:val="ListBullet"/>
-        <w:numPr>
-          <w:ilvl w:val="0"/>
-          <w:numId w:val="0"/>
-        </w:numPr>
+        <w:t>6</w:t>
+      </w:r>
+      <w:r>
         <w:rPr>
           <w:b/>
           <w:bCs/>
@@ -701,8 +1003,130 @@
           <w:sz w:val="28"/>
           <w:szCs w:val="28"/>
         </w:rPr>
-      </w:pPr>
-      <w:r>
+        <w:t>. Data Cleaning</w:t>
+      </w:r>
+    </w:p>
+    <w:p>
+      <w:pPr>
+        <w:pStyle w:val="ListBullet"/>
+        <w:numPr>
+          <w:ilvl w:val="0"/>
+          <w:numId w:val="0"/>
+        </w:numPr>
+        <w:ind w:left="360"/>
+      </w:pPr>
+      <w:r>
+        <w:t>The raw CSV file was loaded using Pandas. Missing values and duplicate records were checked. The Date column was converted to datetime format, duplicate rows were removed, invalid dates were excluded, and column names were cleaned. The resulting dataset was saved as data/retail_store_inventory_cleaned.csv.</w:t>
+      </w:r>
+    </w:p>
+    <w:p>
+      <w:pPr>
+        <w:pStyle w:val="ListBullet"/>
+        <w:numPr>
+          <w:ilvl w:val="0"/>
+          <w:numId w:val="0"/>
+        </w:numPr>
+        <w:ind w:left="360"/>
+      </w:pPr>
+    </w:p>
+    <w:p>
+      <w:pPr>
+        <w:pStyle w:val="ListBullet"/>
+        <w:numPr>
+          <w:ilvl w:val="0"/>
+          <w:numId w:val="0"/>
+        </w:numPr>
+        <w:ind w:left="360"/>
+      </w:pPr>
+      <w:r>
+        <w:t>Cleaning results:</w:t>
+      </w:r>
+    </w:p>
+    <w:p>
+      <w:pPr>
+        <w:pStyle w:val="ListBullet"/>
+        <w:numPr>
+          <w:ilvl w:val="0"/>
+          <w:numId w:val="0"/>
+        </w:numPr>
+        <w:ind w:left="360"/>
+      </w:pPr>
+    </w:p>
+    <w:p>
+      <w:pPr>
+        <w:pStyle w:val="ListBullet"/>
+        <w:numPr>
+          <w:ilvl w:val="0"/>
+          <w:numId w:val="16"/>
+        </w:numPr>
+      </w:pPr>
+      <w:r>
+        <w:t>Dataset size before cleaning: 73,100 rows × 15 columns.</w:t>
+      </w:r>
+    </w:p>
+    <w:p>
+      <w:pPr>
+        <w:pStyle w:val="ListBullet"/>
+        <w:numPr>
+          <w:ilvl w:val="0"/>
+          <w:numId w:val="16"/>
+        </w:numPr>
+      </w:pPr>
+      <w:r>
+        <w:t>Missing values: 0.</w:t>
+      </w:r>
+    </w:p>
+    <w:p>
+      <w:pPr>
+        <w:pStyle w:val="ListBullet"/>
+        <w:numPr>
+          <w:ilvl w:val="0"/>
+          <w:numId w:val="16"/>
+        </w:numPr>
+      </w:pPr>
+      <w:r>
+        <w:t>Duplicate rows: 0.</w:t>
+      </w:r>
+    </w:p>
+    <w:p>
+      <w:pPr>
+        <w:pStyle w:val="ListBullet"/>
+        <w:numPr>
+          <w:ilvl w:val="0"/>
+          <w:numId w:val="16"/>
+        </w:numPr>
+      </w:pPr>
+      <w:r>
+        <w:t>Cleaned dataset size: 73,100 rows × 15 columns.</w:t>
+      </w:r>
+    </w:p>
+    <w:p>
+      <w:pPr>
+        <w:pStyle w:val="ListBullet"/>
+        <w:numPr>
+          <w:ilvl w:val="0"/>
+          <w:numId w:val="0"/>
+        </w:numPr>
+        <w:ind w:left="360"/>
+      </w:pPr>
+    </w:p>
+    <w:p>
+      <w:pPr>
+        <w:pStyle w:val="ListBullet"/>
+        <w:numPr>
+          <w:ilvl w:val="0"/>
+          <w:numId w:val="0"/>
+        </w:numPr>
+        <w:ind w:left="360"/>
+      </w:pPr>
+    </w:p>
+    <w:p>
+      <w:pPr>
+        <w:pStyle w:val="ListBullet"/>
+        <w:numPr>
+          <w:ilvl w:val="0"/>
+          <w:numId w:val="0"/>
+        </w:numPr>
         <w:rPr>
           <w:b/>
           <w:bCs/>
@@ -710,8 +1134,7 @@
           <w:sz w:val="28"/>
           <w:szCs w:val="28"/>
         </w:rPr>
-        <w:t xml:space="preserve">   </w:t>
-      </w:r>
+      </w:pPr>
       <w:r>
         <w:rPr>
           <w:b/>
@@ -720,7 +1143,28 @@
           <w:sz w:val="28"/>
           <w:szCs w:val="28"/>
         </w:rPr>
-        <w:t>6. Exploratory Data Analysis</w:t>
+        <w:lastRenderedPageBreak/>
+        <w:t xml:space="preserve">   </w:t>
+      </w:r>
+      <w:r>
+        <w:rPr>
+          <w:b/>
+          <w:bCs/>
+          <w:color w:val="1F497D" w:themeColor="text2"/>
+          <w:sz w:val="28"/>
+          <w:szCs w:val="28"/>
+        </w:rPr>
+        <w:t>7</w:t>
+      </w:r>
+      <w:r>
+        <w:rPr>
+          <w:b/>
+          <w:bCs/>
+          <w:color w:val="1F497D" w:themeColor="text2"/>
+          <w:sz w:val="28"/>
+          <w:szCs w:val="28"/>
+        </w:rPr>
+        <w:t>. Exploratory Data Analysis</w:t>
       </w:r>
     </w:p>
     <w:p>
@@ -750,10 +1194,7 @@
         </w:numPr>
       </w:pPr>
       <w:r>
-        <w:t xml:space="preserve">    </w:t>
-      </w:r>
-      <w:r>
-        <w:t>category and demand patterns. Charts were created for category sales, regional sales,</w:t>
+        <w:t xml:space="preserve">    category and demand patterns. Charts were created for category sales, regional sales,</w:t>
       </w:r>
     </w:p>
     <w:p>
@@ -807,7 +1248,15 @@
           <w:bCs/>
           <w:color w:val="1F497D" w:themeColor="text2"/>
         </w:rPr>
-        <w:t>6.1 Key Findings</w:t>
+        <w:t>7</w:t>
+      </w:r>
+      <w:r>
+        <w:rPr>
+          <w:b/>
+          <w:bCs/>
+          <w:color w:val="1F497D" w:themeColor="text2"/>
+        </w:rPr>
+        <w:t>.1 Key Findings</w:t>
       </w:r>
     </w:p>
     <w:p>
@@ -960,7 +1409,15 @@
           <w:bCs/>
           <w:color w:val="1F497D" w:themeColor="text2"/>
         </w:rPr>
-        <w:t>6.2 Inventory Risk Analysis</w:t>
+        <w:t>7</w:t>
+      </w:r>
+      <w:r>
+        <w:rPr>
+          <w:b/>
+          <w:bCs/>
+          <w:color w:val="1F497D" w:themeColor="text2"/>
+        </w:rPr>
+        <w:t>.2 Inventory Risk Analysis</w:t>
       </w:r>
     </w:p>
     <w:p>
@@ -1059,10 +1516,23 @@
         </w:numPr>
       </w:pPr>
       <w:r>
+        <w:t xml:space="preserve">          confirmed excess-inventory events. Business-specific inventory thresholds </w:t>
+      </w:r>
+    </w:p>
+    <w:p>
+      <w:pPr>
+        <w:pStyle w:val="ListBullet"/>
+        <w:numPr>
+          <w:ilvl w:val="0"/>
+          <w:numId w:val="0"/>
+        </w:numPr>
+        <w:ind w:left="360" w:hanging="360"/>
+      </w:pPr>
+      <w:r>
         <w:t xml:space="preserve">          </w:t>
       </w:r>
       <w:r>
-        <w:t xml:space="preserve">confirmed excess-inventory events. Business-specific inventory thresholds </w:t>
+        <w:t>would be needed for operational use.</w:t>
       </w:r>
     </w:p>
     <w:p>
@@ -1072,14 +1542,7 @@
           <w:ilvl w:val="0"/>
           <w:numId w:val="0"/>
         </w:numPr>
-        <w:ind w:left="360" w:hanging="360"/>
-      </w:pPr>
-      <w:r>
-        <w:t xml:space="preserve">          </w:t>
-      </w:r>
-      <w:r>
-        <w:t>would be needed for operational use.</w:t>
-      </w:r>
+      </w:pPr>
     </w:p>
     <w:p>
       <w:pPr>
@@ -1138,7 +1601,17 @@
           <w:sz w:val="28"/>
           <w:szCs w:val="28"/>
         </w:rPr>
-        <w:t>7. Demand Prediction Model</w:t>
+        <w:t>8</w:t>
+      </w:r>
+      <w:r>
+        <w:rPr>
+          <w:b/>
+          <w:bCs/>
+          <w:color w:val="1F497D" w:themeColor="text2"/>
+          <w:sz w:val="28"/>
+          <w:szCs w:val="28"/>
+        </w:rPr>
+        <w:t>. Demand Prediction Model</w:t>
       </w:r>
     </w:p>
     <w:p>
@@ -1244,6 +1717,7 @@
         </w:numPr>
       </w:pPr>
       <w:r>
+        <w:lastRenderedPageBreak/>
         <w:t>Competitor Pricing</w:t>
       </w:r>
     </w:p>
@@ -1310,7 +1784,15 @@
           <w:bCs/>
           <w:color w:val="1F497D" w:themeColor="text2"/>
         </w:rPr>
-        <w:t>7.1 Model Results</w:t>
+        <w:t>8</w:t>
+      </w:r>
+      <w:r>
+        <w:rPr>
+          <w:b/>
+          <w:bCs/>
+          <w:color w:val="1F497D" w:themeColor="text2"/>
+        </w:rPr>
+        <w:t>.1 Model Results</w:t>
       </w:r>
     </w:p>
     <w:p>
@@ -1408,6 +1890,16 @@
           <w:ilvl w:val="0"/>
           <w:numId w:val="0"/>
         </w:numPr>
+      </w:pPr>
+    </w:p>
+    <w:p>
+      <w:pPr>
+        <w:pStyle w:val="ListBullet"/>
+        <w:numPr>
+          <w:ilvl w:val="0"/>
+          <w:numId w:val="0"/>
+        </w:numPr>
+        <w:spacing w:line="480" w:lineRule="auto"/>
         <w:ind w:left="360"/>
         <w:rPr>
           <w:b/>
@@ -1425,7 +1917,17 @@
           <w:sz w:val="28"/>
           <w:szCs w:val="28"/>
         </w:rPr>
-        <w:t>8. Business Intelligence Dashboard</w:t>
+        <w:t>9</w:t>
+      </w:r>
+      <w:r>
+        <w:rPr>
+          <w:b/>
+          <w:bCs/>
+          <w:color w:val="1F497D" w:themeColor="text2"/>
+          <w:sz w:val="28"/>
+          <w:szCs w:val="28"/>
+        </w:rPr>
+        <w:t>. Business Intelligence Dashboard</w:t>
       </w:r>
     </w:p>
     <w:p>
@@ -1507,7 +2009,6 @@
         </w:numPr>
       </w:pPr>
       <w:r>
-        <w:lastRenderedPageBreak/>
         <w:t>Average Units Sold KPI.</w:t>
       </w:r>
     </w:p>
@@ -1570,6 +2071,751 @@
       <w:r>
         <w:t>High-Inventory Records.</w:t>
       </w:r>
+    </w:p>
+    <w:p>
+      <w:pPr>
+        <w:pStyle w:val="ListBullet"/>
+        <w:numPr>
+          <w:ilvl w:val="0"/>
+          <w:numId w:val="0"/>
+        </w:numPr>
+        <w:ind w:left="1080"/>
+      </w:pPr>
+    </w:p>
+    <w:p>
+      <w:pPr>
+        <w:pStyle w:val="ListBullet"/>
+        <w:numPr>
+          <w:ilvl w:val="0"/>
+          <w:numId w:val="0"/>
+        </w:numPr>
+        <w:ind w:left="1080"/>
+      </w:pPr>
+    </w:p>
+    <w:p>
+      <w:pPr>
+        <w:pStyle w:val="ListBullet"/>
+        <w:numPr>
+          <w:ilvl w:val="0"/>
+          <w:numId w:val="0"/>
+        </w:numPr>
+        <w:ind w:left="1080"/>
+      </w:pPr>
+    </w:p>
+    <w:p>
+      <w:pPr>
+        <w:pStyle w:val="ListBullet"/>
+        <w:numPr>
+          <w:ilvl w:val="0"/>
+          <w:numId w:val="0"/>
+        </w:numPr>
+        <w:ind w:left="1080"/>
+      </w:pPr>
+    </w:p>
+    <w:p>
+      <w:pPr>
+        <w:pStyle w:val="ListBullet"/>
+        <w:numPr>
+          <w:ilvl w:val="0"/>
+          <w:numId w:val="0"/>
+        </w:numPr>
+        <w:ind w:left="1080"/>
+      </w:pPr>
+    </w:p>
+    <w:p>
+      <w:pPr>
+        <w:pStyle w:val="ListBullet"/>
+        <w:numPr>
+          <w:ilvl w:val="0"/>
+          <w:numId w:val="0"/>
+        </w:numPr>
+        <w:ind w:left="1080"/>
+      </w:pPr>
+    </w:p>
+    <w:p>
+      <w:pPr>
+        <w:pStyle w:val="ListBullet"/>
+        <w:numPr>
+          <w:ilvl w:val="0"/>
+          <w:numId w:val="0"/>
+        </w:numPr>
+        <w:ind w:left="1080"/>
+      </w:pPr>
+    </w:p>
+    <w:p>
+      <w:pPr>
+        <w:pStyle w:val="ListBullet"/>
+        <w:numPr>
+          <w:ilvl w:val="0"/>
+          <w:numId w:val="0"/>
+        </w:numPr>
+        <w:ind w:left="1080"/>
+      </w:pPr>
+    </w:p>
+    <w:p>
+      <w:pPr>
+        <w:pStyle w:val="ListBullet"/>
+        <w:numPr>
+          <w:ilvl w:val="0"/>
+          <w:numId w:val="0"/>
+        </w:numPr>
+        <w:ind w:left="1080"/>
+      </w:pPr>
+    </w:p>
+    <w:p>
+      <w:pPr>
+        <w:pStyle w:val="ListBullet"/>
+        <w:numPr>
+          <w:ilvl w:val="0"/>
+          <w:numId w:val="0"/>
+        </w:numPr>
+        <w:ind w:left="1080"/>
+      </w:pPr>
+    </w:p>
+    <w:p>
+      <w:pPr>
+        <w:pStyle w:val="ListBullet"/>
+        <w:numPr>
+          <w:ilvl w:val="0"/>
+          <w:numId w:val="0"/>
+        </w:numPr>
+        <w:ind w:left="1080"/>
+      </w:pPr>
+    </w:p>
+    <w:p>
+      <w:pPr>
+        <w:pStyle w:val="ListBullet"/>
+        <w:numPr>
+          <w:ilvl w:val="0"/>
+          <w:numId w:val="0"/>
+        </w:numPr>
+        <w:ind w:left="1080"/>
+      </w:pPr>
+    </w:p>
+    <w:p>
+      <w:pPr>
+        <w:pStyle w:val="ListBullet"/>
+        <w:numPr>
+          <w:ilvl w:val="0"/>
+          <w:numId w:val="0"/>
+        </w:numPr>
+        <w:ind w:left="1080"/>
+      </w:pPr>
+    </w:p>
+    <w:p>
+      <w:pPr>
+        <w:pStyle w:val="ListBullet"/>
+        <w:numPr>
+          <w:ilvl w:val="0"/>
+          <w:numId w:val="0"/>
+        </w:numPr>
+        <w:ind w:left="1080"/>
+      </w:pPr>
+    </w:p>
+    <w:p>
+      <w:pPr>
+        <w:pStyle w:val="ListBullet"/>
+        <w:numPr>
+          <w:ilvl w:val="0"/>
+          <w:numId w:val="0"/>
+        </w:numPr>
+        <w:ind w:left="1080"/>
+      </w:pPr>
+    </w:p>
+    <w:p>
+      <w:pPr>
+        <w:pStyle w:val="ListBullet"/>
+        <w:numPr>
+          <w:ilvl w:val="0"/>
+          <w:numId w:val="0"/>
+        </w:numPr>
+        <w:ind w:left="1080"/>
+      </w:pPr>
+    </w:p>
+    <w:p>
+      <w:pPr>
+        <w:pStyle w:val="ListBullet"/>
+        <w:numPr>
+          <w:ilvl w:val="0"/>
+          <w:numId w:val="0"/>
+        </w:numPr>
+        <w:ind w:left="1080"/>
+      </w:pPr>
+    </w:p>
+    <w:p>
+      <w:pPr>
+        <w:pStyle w:val="ListBullet"/>
+        <w:numPr>
+          <w:ilvl w:val="0"/>
+          <w:numId w:val="0"/>
+        </w:numPr>
+        <w:ind w:left="1080"/>
+      </w:pPr>
+    </w:p>
+    <w:p>
+      <w:pPr>
+        <w:pStyle w:val="ListBullet"/>
+        <w:numPr>
+          <w:ilvl w:val="0"/>
+          <w:numId w:val="0"/>
+        </w:numPr>
+        <w:ind w:left="1080"/>
+      </w:pPr>
+    </w:p>
+    <w:p>
+      <w:pPr>
+        <w:pStyle w:val="ListBullet"/>
+        <w:numPr>
+          <w:ilvl w:val="0"/>
+          <w:numId w:val="0"/>
+        </w:numPr>
+        <w:ind w:left="1080"/>
+      </w:pPr>
+    </w:p>
+    <w:p>
+      <w:pPr>
+        <w:pStyle w:val="ListBullet"/>
+        <w:numPr>
+          <w:ilvl w:val="0"/>
+          <w:numId w:val="0"/>
+        </w:numPr>
+        <w:ind w:left="1080"/>
+      </w:pPr>
+    </w:p>
+    <w:p>
+      <w:pPr>
+        <w:pStyle w:val="ListBullet"/>
+        <w:numPr>
+          <w:ilvl w:val="0"/>
+          <w:numId w:val="0"/>
+        </w:numPr>
+        <w:ind w:left="1080"/>
+      </w:pPr>
+    </w:p>
+    <w:p>
+      <w:pPr>
+        <w:pStyle w:val="ListBullet"/>
+        <w:numPr>
+          <w:ilvl w:val="0"/>
+          <w:numId w:val="0"/>
+        </w:numPr>
+        <w:ind w:left="1080"/>
+      </w:pPr>
+    </w:p>
+    <w:p>
+      <w:pPr>
+        <w:pStyle w:val="ListBullet"/>
+        <w:numPr>
+          <w:ilvl w:val="0"/>
+          <w:numId w:val="0"/>
+        </w:numPr>
+        <w:ind w:left="1080"/>
+        <w:rPr>
+          <w:b/>
+          <w:bCs/>
+          <w:color w:val="548DD4" w:themeColor="text2" w:themeTint="99"/>
+          <w:sz w:val="24"/>
+          <w:szCs w:val="24"/>
+        </w:rPr>
+      </w:pPr>
+      <w:r>
+        <w:rPr>
+          <w:b/>
+          <w:bCs/>
+          <w:color w:val="548DD4" w:themeColor="text2" w:themeTint="99"/>
+          <w:sz w:val="24"/>
+          <w:szCs w:val="24"/>
+        </w:rPr>
+        <w:t>Figure 1: Dashboard KPIs and Sales by Category</w:t>
+      </w:r>
+    </w:p>
+    <w:p>
+      <w:pPr>
+        <w:pStyle w:val="ListBullet"/>
+        <w:numPr>
+          <w:ilvl w:val="0"/>
+          <w:numId w:val="0"/>
+        </w:numPr>
+        <w:ind w:left="1080"/>
+        <w:rPr>
+          <w:b/>
+          <w:bCs/>
+          <w:color w:val="548DD4" w:themeColor="text2" w:themeTint="99"/>
+          <w:sz w:val="24"/>
+          <w:szCs w:val="24"/>
+        </w:rPr>
+      </w:pPr>
+    </w:p>
+    <w:p>
+      <w:pPr>
+        <w:pStyle w:val="ListBullet"/>
+        <w:numPr>
+          <w:ilvl w:val="0"/>
+          <w:numId w:val="0"/>
+        </w:numPr>
+        <w:ind w:left="1080"/>
+      </w:pPr>
+    </w:p>
+    <w:p>
+      <w:pPr>
+        <w:pStyle w:val="ListBullet"/>
+        <w:numPr>
+          <w:ilvl w:val="0"/>
+          <w:numId w:val="0"/>
+        </w:numPr>
+        <w:ind w:left="1080"/>
+        <w:jc w:val="right"/>
+      </w:pPr>
+      <w:r>
+        <w:rPr>
+          <w:noProof/>
+        </w:rPr>
+        <w:drawing>
+          <wp:inline distT="0" distB="0" distL="0" distR="0" wp14:anchorId="3C8C8BCA" wp14:editId="5CBA3F1A">
+            <wp:extent cx="5661660" cy="5852160"/>
+            <wp:effectExtent l="0" t="0" r="0" b="0"/>
+            <wp:docPr id="424873790" name="Picture 1"/>
+            <wp:cNvGraphicFramePr>
+              <a:graphicFrameLocks xmlns:a="http://schemas.openxmlformats.org/drawingml/2006/main" noChangeAspect="1"/>
+            </wp:cNvGraphicFramePr>
+            <a:graphic xmlns:a="http://schemas.openxmlformats.org/drawingml/2006/main">
+              <a:graphicData uri="http://schemas.openxmlformats.org/drawingml/2006/picture">
+                <pic:pic xmlns:pic="http://schemas.openxmlformats.org/drawingml/2006/picture">
+                  <pic:nvPicPr>
+                    <pic:cNvPr id="424873790" name="Picture 424873790"/>
+                    <pic:cNvPicPr/>
+                  </pic:nvPicPr>
+                  <pic:blipFill>
+                    <a:blip r:embed="rId6"/>
+                    <a:stretch>
+                      <a:fillRect/>
+                    </a:stretch>
+                  </pic:blipFill>
+                  <pic:spPr>
+                    <a:xfrm>
+                      <a:off x="0" y="0"/>
+                      <a:ext cx="5661660" cy="5852160"/>
+                    </a:xfrm>
+                    <a:prstGeom prst="rect">
+                      <a:avLst/>
+                    </a:prstGeom>
+                  </pic:spPr>
+                </pic:pic>
+              </a:graphicData>
+            </a:graphic>
+          </wp:inline>
+        </w:drawing>
+      </w:r>
+    </w:p>
+    <w:p>
+      <w:pPr>
+        <w:pStyle w:val="ListBullet"/>
+        <w:numPr>
+          <w:ilvl w:val="0"/>
+          <w:numId w:val="0"/>
+        </w:numPr>
+        <w:ind w:left="1080"/>
+      </w:pPr>
+    </w:p>
+    <w:p>
+      <w:pPr>
+        <w:pStyle w:val="ListBullet"/>
+        <w:numPr>
+          <w:ilvl w:val="0"/>
+          <w:numId w:val="0"/>
+        </w:numPr>
+        <w:ind w:left="1080"/>
+        <w:rPr>
+          <w:b/>
+          <w:bCs/>
+          <w:color w:val="548DD4" w:themeColor="text2" w:themeTint="99"/>
+          <w:sz w:val="24"/>
+          <w:szCs w:val="24"/>
+        </w:rPr>
+      </w:pPr>
+      <w:r>
+        <w:rPr>
+          <w:b/>
+          <w:bCs/>
+          <w:color w:val="548DD4" w:themeColor="text2" w:themeTint="99"/>
+          <w:sz w:val="24"/>
+          <w:szCs w:val="24"/>
+        </w:rPr>
+        <w:t>Figure 2: Sales by Region and Demand Forecast vs Actual Sales</w:t>
+      </w:r>
+    </w:p>
+    <w:p>
+      <w:pPr>
+        <w:pStyle w:val="ListBullet"/>
+        <w:numPr>
+          <w:ilvl w:val="0"/>
+          <w:numId w:val="0"/>
+        </w:numPr>
+        <w:ind w:left="1080"/>
+        <w:rPr>
+          <w:b/>
+          <w:bCs/>
+          <w:color w:val="548DD4" w:themeColor="text2" w:themeTint="99"/>
+          <w:sz w:val="24"/>
+          <w:szCs w:val="24"/>
+        </w:rPr>
+      </w:pPr>
+    </w:p>
+    <w:p>
+      <w:pPr>
+        <w:pStyle w:val="ListBullet"/>
+        <w:numPr>
+          <w:ilvl w:val="0"/>
+          <w:numId w:val="0"/>
+        </w:numPr>
+        <w:ind w:left="1080"/>
+        <w:rPr>
+          <w:b/>
+          <w:bCs/>
+          <w:color w:val="548DD4" w:themeColor="text2" w:themeTint="99"/>
+          <w:sz w:val="24"/>
+          <w:szCs w:val="24"/>
+        </w:rPr>
+      </w:pPr>
+    </w:p>
+    <w:p>
+      <w:pPr>
+        <w:pStyle w:val="ListBullet"/>
+        <w:numPr>
+          <w:ilvl w:val="0"/>
+          <w:numId w:val="0"/>
+        </w:numPr>
+        <w:ind w:left="1080"/>
+        <w:rPr>
+          <w:b/>
+          <w:bCs/>
+          <w:color w:val="548DD4" w:themeColor="text2" w:themeTint="99"/>
+          <w:sz w:val="24"/>
+          <w:szCs w:val="24"/>
+        </w:rPr>
+      </w:pPr>
+    </w:p>
+    <w:p>
+      <w:pPr>
+        <w:pStyle w:val="ListBullet"/>
+        <w:numPr>
+          <w:ilvl w:val="0"/>
+          <w:numId w:val="0"/>
+        </w:numPr>
+        <w:ind w:left="1080"/>
+        <w:rPr>
+          <w:b/>
+          <w:bCs/>
+          <w:color w:val="548DD4" w:themeColor="text2" w:themeTint="99"/>
+          <w:sz w:val="24"/>
+          <w:szCs w:val="24"/>
+        </w:rPr>
+      </w:pPr>
+    </w:p>
+    <w:p>
+      <w:pPr>
+        <w:pStyle w:val="ListBullet"/>
+        <w:numPr>
+          <w:ilvl w:val="0"/>
+          <w:numId w:val="0"/>
+        </w:numPr>
+        <w:ind w:left="1080"/>
+      </w:pPr>
+      <w:r>
+        <w:rPr>
+          <w:noProof/>
+        </w:rPr>
+        <w:drawing>
+          <wp:inline distT="0" distB="0" distL="0" distR="0" wp14:anchorId="33C5CC9A" wp14:editId="5B5D2248">
+            <wp:extent cx="5631180" cy="5920740"/>
+            <wp:effectExtent l="0" t="0" r="7620" b="3810"/>
+            <wp:docPr id="867140000" name="Picture 2"/>
+            <wp:cNvGraphicFramePr>
+              <a:graphicFrameLocks xmlns:a="http://schemas.openxmlformats.org/drawingml/2006/main" noChangeAspect="1"/>
+            </wp:cNvGraphicFramePr>
+            <a:graphic xmlns:a="http://schemas.openxmlformats.org/drawingml/2006/main">
+              <a:graphicData uri="http://schemas.openxmlformats.org/drawingml/2006/picture">
+                <pic:pic xmlns:pic="http://schemas.openxmlformats.org/drawingml/2006/picture">
+                  <pic:nvPicPr>
+                    <pic:cNvPr id="867140000" name="Picture 867140000"/>
+                    <pic:cNvPicPr/>
+                  </pic:nvPicPr>
+                  <pic:blipFill>
+                    <a:blip r:embed="rId7"/>
+                    <a:stretch>
+                      <a:fillRect/>
+                    </a:stretch>
+                  </pic:blipFill>
+                  <pic:spPr>
+                    <a:xfrm>
+                      <a:off x="0" y="0"/>
+                      <a:ext cx="5631180" cy="5920740"/>
+                    </a:xfrm>
+                    <a:prstGeom prst="rect">
+                      <a:avLst/>
+                    </a:prstGeom>
+                  </pic:spPr>
+                </pic:pic>
+              </a:graphicData>
+            </a:graphic>
+          </wp:inline>
+        </w:drawing>
+      </w:r>
+    </w:p>
+    <w:p>
+      <w:pPr>
+        <w:pStyle w:val="ListBullet"/>
+        <w:numPr>
+          <w:ilvl w:val="0"/>
+          <w:numId w:val="0"/>
+        </w:numPr>
+        <w:ind w:left="1080"/>
+      </w:pPr>
+    </w:p>
+    <w:p>
+      <w:pPr>
+        <w:pStyle w:val="ListBullet"/>
+        <w:numPr>
+          <w:ilvl w:val="0"/>
+          <w:numId w:val="0"/>
+        </w:numPr>
+        <w:ind w:left="1080"/>
+        <w:rPr>
+          <w:b/>
+          <w:bCs/>
+          <w:color w:val="548DD4" w:themeColor="text2" w:themeTint="99"/>
+          <w:sz w:val="24"/>
+          <w:szCs w:val="24"/>
+        </w:rPr>
+      </w:pPr>
+    </w:p>
+    <w:p>
+      <w:pPr>
+        <w:pStyle w:val="ListBullet"/>
+        <w:numPr>
+          <w:ilvl w:val="0"/>
+          <w:numId w:val="0"/>
+        </w:numPr>
+        <w:ind w:left="1080"/>
+        <w:rPr>
+          <w:b/>
+          <w:bCs/>
+          <w:color w:val="548DD4" w:themeColor="text2" w:themeTint="99"/>
+          <w:sz w:val="24"/>
+          <w:szCs w:val="24"/>
+        </w:rPr>
+      </w:pPr>
+    </w:p>
+    <w:p>
+      <w:pPr>
+        <w:pStyle w:val="ListBullet"/>
+        <w:numPr>
+          <w:ilvl w:val="0"/>
+          <w:numId w:val="0"/>
+        </w:numPr>
+        <w:ind w:left="1080"/>
+        <w:rPr>
+          <w:b/>
+          <w:bCs/>
+          <w:color w:val="548DD4" w:themeColor="text2" w:themeTint="99"/>
+          <w:sz w:val="24"/>
+          <w:szCs w:val="24"/>
+        </w:rPr>
+      </w:pPr>
+    </w:p>
+    <w:p>
+      <w:pPr>
+        <w:pStyle w:val="ListBullet"/>
+        <w:numPr>
+          <w:ilvl w:val="0"/>
+          <w:numId w:val="0"/>
+        </w:numPr>
+        <w:ind w:left="1080"/>
+        <w:rPr>
+          <w:b/>
+          <w:bCs/>
+          <w:color w:val="548DD4" w:themeColor="text2" w:themeTint="99"/>
+          <w:sz w:val="24"/>
+          <w:szCs w:val="24"/>
+        </w:rPr>
+      </w:pPr>
+    </w:p>
+    <w:p>
+      <w:pPr>
+        <w:pStyle w:val="ListBullet"/>
+        <w:numPr>
+          <w:ilvl w:val="0"/>
+          <w:numId w:val="0"/>
+        </w:numPr>
+        <w:ind w:left="1080"/>
+        <w:rPr>
+          <w:b/>
+          <w:bCs/>
+          <w:color w:val="548DD4" w:themeColor="text2" w:themeTint="99"/>
+          <w:sz w:val="24"/>
+          <w:szCs w:val="24"/>
+        </w:rPr>
+      </w:pPr>
+    </w:p>
+    <w:p>
+      <w:pPr>
+        <w:pStyle w:val="ListBullet"/>
+        <w:numPr>
+          <w:ilvl w:val="0"/>
+          <w:numId w:val="0"/>
+        </w:numPr>
+        <w:ind w:left="1080"/>
+        <w:rPr>
+          <w:b/>
+          <w:bCs/>
+          <w:color w:val="548DD4" w:themeColor="text2" w:themeTint="99"/>
+          <w:sz w:val="24"/>
+          <w:szCs w:val="24"/>
+        </w:rPr>
+      </w:pPr>
+      <w:r>
+        <w:rPr>
+          <w:b/>
+          <w:bCs/>
+          <w:color w:val="548DD4" w:themeColor="text2" w:themeTint="99"/>
+          <w:sz w:val="24"/>
+          <w:szCs w:val="24"/>
+        </w:rPr>
+        <w:t>Figure 3: Demand Forecast and Inventory Risk</w:t>
+      </w:r>
+    </w:p>
+    <w:p>
+      <w:pPr>
+        <w:pStyle w:val="ListBullet"/>
+        <w:numPr>
+          <w:ilvl w:val="0"/>
+          <w:numId w:val="0"/>
+        </w:numPr>
+        <w:ind w:left="1080"/>
+        <w:rPr>
+          <w:b/>
+          <w:bCs/>
+          <w:color w:val="548DD4" w:themeColor="text2" w:themeTint="99"/>
+          <w:sz w:val="24"/>
+          <w:szCs w:val="24"/>
+        </w:rPr>
+      </w:pPr>
+    </w:p>
+    <w:p>
+      <w:pPr>
+        <w:pStyle w:val="ListBullet"/>
+        <w:numPr>
+          <w:ilvl w:val="0"/>
+          <w:numId w:val="0"/>
+        </w:numPr>
+        <w:ind w:left="1080"/>
+        <w:rPr>
+          <w:b/>
+          <w:bCs/>
+          <w:color w:val="548DD4" w:themeColor="text2" w:themeTint="99"/>
+          <w:sz w:val="24"/>
+          <w:szCs w:val="24"/>
+        </w:rPr>
+      </w:pPr>
+    </w:p>
+    <w:p>
+      <w:pPr>
+        <w:pStyle w:val="ListBullet"/>
+        <w:numPr>
+          <w:ilvl w:val="0"/>
+          <w:numId w:val="0"/>
+        </w:numPr>
+        <w:ind w:left="1080"/>
+        <w:rPr>
+          <w:b/>
+          <w:bCs/>
+          <w:color w:val="548DD4" w:themeColor="text2" w:themeTint="99"/>
+          <w:sz w:val="24"/>
+          <w:szCs w:val="24"/>
+        </w:rPr>
+      </w:pPr>
+    </w:p>
+    <w:p>
+      <w:pPr>
+        <w:pStyle w:val="ListBullet"/>
+        <w:numPr>
+          <w:ilvl w:val="0"/>
+          <w:numId w:val="0"/>
+        </w:numPr>
+        <w:ind w:left="1080"/>
+        <w:rPr>
+          <w:b/>
+          <w:bCs/>
+          <w:color w:val="548DD4" w:themeColor="text2" w:themeTint="99"/>
+          <w:sz w:val="24"/>
+          <w:szCs w:val="24"/>
+        </w:rPr>
+      </w:pPr>
+      <w:r>
+        <w:rPr>
+          <w:b/>
+          <w:bCs/>
+          <w:noProof/>
+          <w:color w:val="1F497D" w:themeColor="text2"/>
+          <w:sz w:val="24"/>
+          <w:szCs w:val="24"/>
+        </w:rPr>
+        <w:drawing>
+          <wp:inline distT="0" distB="0" distL="0" distR="0" wp14:anchorId="31941916" wp14:editId="360F7871">
+            <wp:extent cx="5631180" cy="6576060"/>
+            <wp:effectExtent l="0" t="0" r="7620" b="0"/>
+            <wp:docPr id="817036062" name="Picture 3"/>
+            <wp:cNvGraphicFramePr>
+              <a:graphicFrameLocks xmlns:a="http://schemas.openxmlformats.org/drawingml/2006/main" noChangeAspect="1"/>
+            </wp:cNvGraphicFramePr>
+            <a:graphic xmlns:a="http://schemas.openxmlformats.org/drawingml/2006/main">
+              <a:graphicData uri="http://schemas.openxmlformats.org/drawingml/2006/picture">
+                <pic:pic xmlns:pic="http://schemas.openxmlformats.org/drawingml/2006/picture">
+                  <pic:nvPicPr>
+                    <pic:cNvPr id="817036062" name="Picture 817036062"/>
+                    <pic:cNvPicPr/>
+                  </pic:nvPicPr>
+                  <pic:blipFill>
+                    <a:blip r:embed="rId8"/>
+                    <a:stretch>
+                      <a:fillRect/>
+                    </a:stretch>
+                  </pic:blipFill>
+                  <pic:spPr>
+                    <a:xfrm>
+                      <a:off x="0" y="0"/>
+                      <a:ext cx="5631180" cy="6576060"/>
+                    </a:xfrm>
+                    <a:prstGeom prst="rect">
+                      <a:avLst/>
+                    </a:prstGeom>
+                  </pic:spPr>
+                </pic:pic>
+              </a:graphicData>
+            </a:graphic>
+          </wp:inline>
+        </w:drawing>
+      </w:r>
+    </w:p>
+    <w:p>
+      <w:pPr>
+        <w:pStyle w:val="ListBullet"/>
+        <w:numPr>
+          <w:ilvl w:val="0"/>
+          <w:numId w:val="0"/>
+        </w:numPr>
+        <w:ind w:left="1080"/>
+      </w:pPr>
+    </w:p>
+    <w:p>
+      <w:pPr>
+        <w:pStyle w:val="ListBullet"/>
+        <w:numPr>
+          <w:ilvl w:val="0"/>
+          <w:numId w:val="0"/>
+        </w:numPr>
+        <w:ind w:left="360"/>
+      </w:pPr>
     </w:p>
     <w:p>
       <w:pPr>
@@ -1729,6 +2975,15 @@
           <w:ilvl w:val="0"/>
           <w:numId w:val="0"/>
         </w:numPr>
+      </w:pPr>
+    </w:p>
+    <w:p>
+      <w:pPr>
+        <w:pStyle w:val="ListBullet"/>
+        <w:numPr>
+          <w:ilvl w:val="0"/>
+          <w:numId w:val="0"/>
+        </w:numPr>
         <w:ind w:left="360"/>
         <w:rPr>
           <w:b/>
@@ -1897,6 +3152,16 @@
           <w:numId w:val="0"/>
         </w:numPr>
         <w:ind w:left="360"/>
+      </w:pPr>
+    </w:p>
+    <w:p>
+      <w:pPr>
+        <w:pStyle w:val="ListBullet"/>
+        <w:numPr>
+          <w:ilvl w:val="0"/>
+          <w:numId w:val="0"/>
+        </w:numPr>
+        <w:ind w:left="360"/>
         <w:rPr>
           <w:b/>
           <w:bCs/>
@@ -1957,6 +3222,16 @@
           <w:numId w:val="0"/>
         </w:numPr>
         <w:ind w:left="360"/>
+      </w:pPr>
+    </w:p>
+    <w:p>
+      <w:pPr>
+        <w:pStyle w:val="ListBullet"/>
+        <w:numPr>
+          <w:ilvl w:val="0"/>
+          <w:numId w:val="0"/>
+        </w:numPr>
+        <w:ind w:left="360"/>
         <w:rPr>
           <w:b/>
           <w:bCs/>
@@ -2026,13 +3301,7 @@
         </w:numPr>
       </w:pPr>
       <w:r>
-        <w:t xml:space="preserve">             </w:t>
-      </w:r>
-      <w:r>
-        <w:t>forecasting problem.</w:t>
-      </w:r>
-      <w:r>
-        <w:t xml:space="preserve">         </w:t>
+        <w:t xml:space="preserve">             forecasting problem.         </w:t>
       </w:r>
     </w:p>
     <w:p>
@@ -2061,11 +3330,7 @@
         <w:ind w:left="360"/>
       </w:pPr>
       <w:r>
-        <w:lastRenderedPageBreak/>
-        <w:t xml:space="preserve">       </w:t>
-      </w:r>
-      <w:r>
-        <w:t>defined rules.</w:t>
+        <w:t xml:space="preserve">       defined rules.</w:t>
       </w:r>
     </w:p>
     <w:p>
@@ -2095,13 +3360,7 @@
         </w:numPr>
       </w:pPr>
       <w:r>
-        <w:t xml:space="preserve">            </w:t>
-      </w:r>
-      <w:r>
-        <w:t>inventory ordering.</w:t>
-      </w:r>
-      <w:r>
-        <w:t xml:space="preserve"> </w:t>
+        <w:t xml:space="preserve">            inventory ordering. </w:t>
       </w:r>
     </w:p>
     <w:p>
@@ -2142,6 +3401,7 @@
         </w:rPr>
       </w:pPr>
       <w:r>
+        <w:lastRenderedPageBreak/>
         <w:t xml:space="preserve">    </w:t>
       </w:r>
       <w:r>
@@ -2281,6 +3541,16 @@
           <w:numId w:val="0"/>
         </w:numPr>
         <w:ind w:left="360"/>
+      </w:pPr>
+    </w:p>
+    <w:p>
+      <w:pPr>
+        <w:pStyle w:val="ListBullet"/>
+        <w:numPr>
+          <w:ilvl w:val="0"/>
+          <w:numId w:val="0"/>
+        </w:numPr>
+        <w:ind w:left="360"/>
         <w:rPr>
           <w:b/>
           <w:bCs/>
@@ -2312,6 +3582,16 @@
       <w:r>
         <w:t>The Inventory Demand Prediction and Stock Optimization Intelligence System demonstrates a complete Business Intelligence workflow from raw retail data to business insights, predictive analysis, and dashboard reporting. The project provides a foundation for improving inventory visibility and can be extended with more advanced forecasting and optimization techniques.</w:t>
       </w:r>
+    </w:p>
+    <w:p>
+      <w:pPr>
+        <w:pStyle w:val="ListBullet"/>
+        <w:numPr>
+          <w:ilvl w:val="0"/>
+          <w:numId w:val="0"/>
+        </w:numPr>
+        <w:ind w:left="360"/>
+      </w:pPr>
     </w:p>
     <w:p>
       <w:pPr>

</xml_diff>

<commit_message>
Update report with dashboard screenshots
</commit_message>
<xml_diff>
--- a/reports/Inventory_Demand_Prediction_ProjectReport.docx
+++ b/reports/Inventory_Demand_Prediction_ProjectReport.docx
@@ -6,17 +6,35 @@
       <w:pPr>
         <w:jc w:val="center"/>
         <w:rPr>
-          <w:sz w:val="44"/>
-          <w:szCs w:val="44"/>
+          <w:sz w:val="48"/>
+          <w:szCs w:val="48"/>
         </w:rPr>
       </w:pPr>
       <w:r>
         <w:rPr>
           <w:b/>
-          <w:sz w:val="44"/>
-          <w:szCs w:val="44"/>
+          <w:sz w:val="48"/>
+          <w:szCs w:val="48"/>
         </w:rPr>
         <w:t>Inventory Demand Prediction and Stock Optimization Intelligence System</w:t>
+      </w:r>
+    </w:p>
+    <w:p>
+      <w:pPr>
+        <w:jc w:val="center"/>
+        <w:rPr>
+          <w:b/>
+          <w:color w:val="365F91" w:themeColor="accent1" w:themeShade="BF"/>
+          <w:sz w:val="26"/>
+        </w:rPr>
+      </w:pPr>
+      <w:r>
+        <w:rPr>
+          <w:b/>
+          <w:color w:val="365F91" w:themeColor="accent1" w:themeShade="BF"/>
+          <w:sz w:val="26"/>
+        </w:rPr>
+        <w:t>Business Intelligence Project Report</w:t>
       </w:r>
     </w:p>
     <w:p>
@@ -27,13 +45,6 @@
           <w:sz w:val="26"/>
         </w:rPr>
       </w:pPr>
-      <w:r>
-        <w:rPr>
-          <w:b/>
-          <w:sz w:val="26"/>
-        </w:rPr>
-        <w:t>Business Intelligence Project Report</w:t>
-      </w:r>
     </w:p>
     <w:p>
       <w:pPr>
@@ -46,15 +57,6 @@
     </w:p>
     <w:p>
       <w:pPr>
-        <w:jc w:val="center"/>
-        <w:rPr>
-          <w:b/>
-          <w:sz w:val="26"/>
-        </w:rPr>
-      </w:pPr>
-    </w:p>
-    <w:p>
-      <w:pPr>
         <w:rPr>
           <w:b/>
           <w:sz w:val="26"/>
@@ -80,7 +82,45 @@
           <w:bCs/>
           <w:sz w:val="26"/>
         </w:rPr>
-        <w:t xml:space="preserve">                     Prepared by: Bagulakoti Abhigna</w:t>
+        <w:t xml:space="preserve">                   </w:t>
+      </w:r>
+    </w:p>
+    <w:p>
+      <w:pPr>
+        <w:rPr>
+          <w:bCs/>
+          <w:sz w:val="26"/>
+        </w:rPr>
+      </w:pPr>
+    </w:p>
+    <w:p>
+      <w:pPr>
+        <w:rPr>
+          <w:bCs/>
+          <w:sz w:val="26"/>
+        </w:rPr>
+      </w:pPr>
+    </w:p>
+    <w:p>
+      <w:pPr>
+        <w:rPr>
+          <w:bCs/>
+          <w:sz w:val="26"/>
+        </w:rPr>
+      </w:pPr>
+      <w:r>
+        <w:rPr>
+          <w:bCs/>
+          <w:sz w:val="26"/>
+        </w:rPr>
+        <w:t xml:space="preserve">                   </w:t>
+      </w:r>
+      <w:r>
+        <w:rPr>
+          <w:bCs/>
+          <w:sz w:val="26"/>
+        </w:rPr>
+        <w:t xml:space="preserve">  Prepared by: Bagulakoti Abhigna</w:t>
       </w:r>
     </w:p>
     <w:p>
@@ -500,7 +540,11 @@
         <w:ind w:left="360" w:hanging="360"/>
       </w:pPr>
       <w:r>
-        <w:t xml:space="preserve">      Retail businesses need to maintain appropriate inventory levels. Excess inventory can increase holding and storage costs, while insufficient inventory can create potential stock shortages and missed sales opportunities. The objective of this project is to use historical retail data to understand demand and inventory patterns and provide useful information for inventory planning.</w:t>
+        <w:t xml:space="preserve">      Retail businesses need to maintain appropriate inventory levels. Excess inventory can increase holding and storage costs, while insufficient inventory can create potential stock shortages and missed sales opportunities. The objective of this project is to use historical </w:t>
+      </w:r>
+      <w:r>
+        <w:lastRenderedPageBreak/>
+        <w:t>retail data to understand demand and inventory patterns and provide useful information for inventory planning.</w:t>
       </w:r>
     </w:p>
     <w:p>
@@ -600,7 +644,6 @@
         </w:numPr>
       </w:pPr>
       <w:r>
-        <w:lastRenderedPageBreak/>
         <w:t>Analyze sales patterns by category, region, and date.</w:t>
       </w:r>
     </w:p>
@@ -1143,7 +1186,6 @@
           <w:sz w:val="28"/>
           <w:szCs w:val="28"/>
         </w:rPr>
-        <w:lastRenderedPageBreak/>
         <w:t xml:space="preserve">   </w:t>
       </w:r>
       <w:r>
@@ -1717,7 +1759,6 @@
         </w:numPr>
       </w:pPr>
       <w:r>
-        <w:lastRenderedPageBreak/>
         <w:t>Competitor Pricing</w:t>
       </w:r>
     </w:p>
@@ -2370,6 +2411,7 @@
         <w:rPr>
           <w:noProof/>
         </w:rPr>
+        <w:lastRenderedPageBreak/>
         <w:drawing>
           <wp:inline distT="0" distB="0" distL="0" distR="0" wp14:anchorId="3C8C8BCA" wp14:editId="5CBA3F1A">
             <wp:extent cx="5661660" cy="5852160"/>
@@ -2525,6 +2567,7 @@
         <w:rPr>
           <w:noProof/>
         </w:rPr>
+        <w:lastRenderedPageBreak/>
         <w:drawing>
           <wp:inline distT="0" distB="0" distL="0" distR="0" wp14:anchorId="33C5CC9A" wp14:editId="5B5D2248">
             <wp:extent cx="5631180" cy="5920740"/>
@@ -2760,6 +2803,7 @@
           <w:sz w:val="24"/>
           <w:szCs w:val="24"/>
         </w:rPr>
+        <w:lastRenderedPageBreak/>
         <w:drawing>
           <wp:inline distT="0" distB="0" distL="0" distR="0" wp14:anchorId="31941916" wp14:editId="360F7871">
             <wp:extent cx="5631180" cy="6576060"/>
@@ -2921,6 +2965,7 @@
         </w:numPr>
       </w:pPr>
       <w:r>
+        <w:lastRenderedPageBreak/>
         <w:t>Scikit-learn</w:t>
       </w:r>
     </w:p>
@@ -3401,7 +3446,6 @@
         </w:rPr>
       </w:pPr>
       <w:r>
-        <w:lastRenderedPageBreak/>
         <w:t xml:space="preserve">    </w:t>
       </w:r>
       <w:r>
@@ -3495,6 +3539,7 @@
         <w:ind w:left="360"/>
       </w:pPr>
       <w:r>
+        <w:lastRenderedPageBreak/>
         <w:tab/>
         <w:t>Add automated reorder recommendations.</w:t>
       </w:r>

</xml_diff>